<commit_message>
Update docs for PC audio, switched black keys and the frame
Covers this round of design changes: 18 switches and their pin map, the
no-speaker wiring, why the white keys are notched, the parts manifest
gaining the frame, and the printed route's integral feet replacing bought
standoffs on that route.

Figures re-synced across every document: printed route 502 g / $321,
grand total ~$457, 2 spare switches of the 20 ordered rather than 9.

Also fixes the markdown-to-docx converter, which was silently dropping
backslash-escaped characters. The first attempt made it worse by leaving
the escaped asterisk in place with a marker beside it, so the italic rule
paired the two surviving asterisks and ate both. It now swaps escaped
characters out of the text the markup scanner sees and restores them on
output, verified against a test document covering paragraphs, tables,
bold, italic, code and links.

Co-Authored-By: Claude Opus 5 <noreply@anthropic.com>
</commit_message>
<xml_diff>
--- a/physical_piano/share/Physical_Piano_BOM.docx
+++ b/physical_piano/share/Physical_Piano_BOM.docx
@@ -610,7 +610,7 @@
             <w:vAlign w:val="top"/>
           </w:tcPr>
           <w:p>
-            <w:hyperlink w:history="1" r:id="rIdiduu0r2qikhslfn84ydhu">
+            <w:hyperlink w:history="1" r:id="rId6osw0bmdwe9jy1jsl3kce">
               <w:r>
                 <w:rPr>
                   <w:rStyle w:val="Hyperlink"/>
@@ -751,7 +751,7 @@
             <w:vAlign w:val="top"/>
           </w:tcPr>
           <w:p>
-            <w:hyperlink w:history="1" r:id="rIdwizmmvjv9kbzygjz6ub-8">
+            <w:hyperlink w:history="1" r:id="rIdbnmdupbub4sm6eano66pl">
               <w:r>
                 <w:rPr>
                   <w:rStyle w:val="Hyperlink"/>
@@ -767,7 +767,7 @@
               </w:rPr>
               <w:t xml:space="preserve">  ·  </w:t>
             </w:r>
-            <w:hyperlink w:history="1" r:id="rId27xqdhmomsv9r6lty2vxk">
+            <w:hyperlink w:history="1" r:id="rIdi_oqds7l4jbcvsfv_2keh">
               <w:r>
                 <w:rPr>
                   <w:rStyle w:val="Hyperlink"/>
@@ -1110,7 +1110,7 @@
             <w:vAlign w:val="top"/>
           </w:tcPr>
           <w:p>
-            <w:hyperlink w:history="1" r:id="rIdn-s_gzbvzu2juk-0oyjcf">
+            <w:hyperlink w:history="1" r:id="rId4g2twlrmihujzi7s_tgkg">
               <w:r>
                 <w:rPr>
                   <w:rStyle w:val="Hyperlink"/>
@@ -1126,7 +1126,7 @@
               </w:rPr>
               <w:t xml:space="preserve">  ·  </w:t>
             </w:r>
-            <w:hyperlink w:history="1" r:id="rIdzw_lbe31amusnxxclze8g">
+            <w:hyperlink w:history="1" r:id="rIddstdbepdphglru3fho8tk">
               <w:r>
                 <w:rPr>
                   <w:rStyle w:val="Hyperlink"/>
@@ -1267,7 +1267,7 @@
             <w:vAlign w:val="top"/>
           </w:tcPr>
           <w:p>
-            <w:hyperlink w:history="1" r:id="rIdgpvyi7_mnrvudxprg9bsn">
+            <w:hyperlink w:history="1" r:id="rIdttc6onqwy8knjyert4n-z">
               <w:r>
                 <w:rPr>
                   <w:rStyle w:val="Hyperlink"/>
@@ -1408,7 +1408,7 @@
             <w:vAlign w:val="top"/>
           </w:tcPr>
           <w:p>
-            <w:hyperlink w:history="1" r:id="rIdveh3jmuryukszgntkkhaf">
+            <w:hyperlink w:history="1" r:id="rIdadgh4fdpbhoap-70h33d3">
               <w:r>
                 <w:rPr>
                   <w:rStyle w:val="Hyperlink"/>
@@ -1549,7 +1549,7 @@
             <w:vAlign w:val="top"/>
           </w:tcPr>
           <w:p>
-            <w:hyperlink w:history="1" r:id="rId1vmahl5p268za-eqstdsr">
+            <w:hyperlink w:history="1" r:id="rIdeenksvavknagq58sb8kvy">
               <w:r>
                 <w:rPr>
                   <w:rStyle w:val="Hyperlink"/>
@@ -1892,7 +1892,7 @@
             <w:vAlign w:val="top"/>
           </w:tcPr>
           <w:p>
-            <w:hyperlink w:history="1" r:id="rIdmacapzrz4idvpc9jo55at">
+            <w:hyperlink w:history="1" r:id="rId4_ltrjkeasyzsxdh2rrzt">
               <w:r>
                 <w:rPr>
                   <w:rStyle w:val="Hyperlink"/>
@@ -2033,7 +2033,7 @@
             <w:vAlign w:val="top"/>
           </w:tcPr>
           <w:p>
-            <w:hyperlink w:history="1" r:id="rIdnrnmimdsutkrmuk_ou_wx">
+            <w:hyperlink w:history="1" r:id="rIdqmvfwx2x8nybvsij48mkq">
               <w:r>
                 <w:rPr>
                   <w:rStyle w:val="Hyperlink"/>
@@ -2049,7 +2049,7 @@
               </w:rPr>
               <w:t xml:space="preserve">  ·  </w:t>
             </w:r>
-            <w:hyperlink w:history="1" r:id="rIdouiomuiefwzogwapta167">
+            <w:hyperlink w:history="1" r:id="rId00dwhvn9pywdpfuin7aoy">
               <w:r>
                 <w:rPr>
                   <w:rStyle w:val="Hyperlink"/>
@@ -2190,7 +2190,7 @@
             <w:vAlign w:val="top"/>
           </w:tcPr>
           <w:p>
-            <w:hyperlink w:history="1" r:id="rIdeqafzm42en39aadtjiplz">
+            <w:hyperlink w:history="1" r:id="rIdb6r0gwr5minro05ktbunb">
               <w:r>
                 <w:rPr>
                   <w:rStyle w:val="Hyperlink"/>
@@ -2206,7 +2206,7 @@
               </w:rPr>
               <w:t xml:space="preserve">  ·  </w:t>
             </w:r>
-            <w:hyperlink w:history="1" r:id="rId9twpriajpuwt7ycupmj4y">
+            <w:hyperlink w:history="1" r:id="rIdji7grnnr3gkrsnygui_f4">
               <w:r>
                 <w:rPr>
                   <w:rStyle w:val="Hyperlink"/>
@@ -2347,7 +2347,7 @@
             <w:vAlign w:val="top"/>
           </w:tcPr>
           <w:p>
-            <w:hyperlink w:history="1" r:id="rId8yqqsgpfz1uj9vt87yme_">
+            <w:hyperlink w:history="1" r:id="rIdrd6khe_r09hnqps9bz5dc">
               <w:r>
                 <w:rPr>
                   <w:rStyle w:val="Hyperlink"/>
@@ -2488,7 +2488,7 @@
             <w:vAlign w:val="top"/>
           </w:tcPr>
           <w:p>
-            <w:hyperlink w:history="1" r:id="rIdv-deikp9uqbs1abmvwnw9">
+            <w:hyperlink w:history="1" r:id="rIdb--suolfo3otrtrbf_oju">
               <w:r>
                 <w:rPr>
                   <w:rStyle w:val="Hyperlink"/>
@@ -2629,7 +2629,7 @@
             <w:vAlign w:val="top"/>
           </w:tcPr>
           <w:p>
-            <w:hyperlink w:history="1" r:id="rIdq-yso35fl1gox1tkjs9_z">
+            <w:hyperlink w:history="1" r:id="rIdqd8djzsl6onmojumhdkl4">
               <w:r>
                 <w:rPr>
                   <w:rStyle w:val="Hyperlink"/>
@@ -2770,7 +2770,7 @@
             <w:vAlign w:val="top"/>
           </w:tcPr>
           <w:p>
-            <w:hyperlink w:history="1" r:id="rIdfx_jfr7su5cslniuhk-0k">
+            <w:hyperlink w:history="1" r:id="rId6yc0nq7-wtegvdne5zuqm">
               <w:r>
                 <w:rPr>
                   <w:rStyle w:val="Hyperlink"/>
@@ -2911,7 +2911,7 @@
             <w:vAlign w:val="top"/>
           </w:tcPr>
           <w:p>
-            <w:hyperlink w:history="1" r:id="rIdqzbpcjk9bbrkl9hidn0pz">
+            <w:hyperlink w:history="1" r:id="rIdhxaz6kidkrfkr8wyy-a9o">
               <w:r>
                 <w:rPr>
                   <w:rStyle w:val="Hyperlink"/>
@@ -2946,7 +2946,7 @@
         </w:rPr>
         <w:t xml:space="preserve">skip the perfboard and soldering kit above and use a screw-terminal shield instead — each wire clamps under a screw. Less permanent than solder but far more robust than a bare breadboard.  </w:t>
       </w:r>
-      <w:hyperlink w:history="1" r:id="rIdgmby1or2b_d72_8q5necj">
+      <w:hyperlink w:history="1" r:id="rIdbn8bykarqvq-c5kd5uhtt">
         <w:r>
           <w:rPr>
             <w:rStyle w:val="Hyperlink"/>

</xml_diff>